<commit_message>
Yöntem 1 geliştirme: yüksek varyans (±3.9) bulundu, 5-model SpecAugment topluluğu ile kararlı %62.3; training.py'ye label_smoothing+mixup (kapalı-varsayılan); rapor+sunum+notlar eşitlendi
</commit_message>
<xml_diff>
--- a/final/PROJE_FINAL_RAPORU.docx
+++ b/final/PROJE_FINAL_RAPORU.docx
@@ -58,7 +58,7 @@
         <w:pStyle w:val="ListBullet"/>
       </w:pPr>
       <w:r>
-        <w:t>Yöntem 1 (mel + CNN) test sonucu: doğruluk 0.6264, macro-F1 0.6282.</w:t>
+        <w:t>Yöntem 1 (mel + CNN) nihai test sonucu: SpecAugment topluluğu (5 model) ile doğruluk 0.623, macro-F1 0.625. Tek CNN kararsızdı (5 koşu ort. 0.558 ± 0.039); topluluk bunu kararlı ve tekrar üretilebilir hale getirdi (arama-kazananı tek koşu 0.6264 idi).</w:t>
       </w:r>
     </w:p>
     <w:p>
@@ -4486,6 +4486,258 @@
       </w:r>
     </w:p>
     <w:p>
+      <w:pPr>
+        <w:pStyle w:val="Heading2"/>
+      </w:pPr>
+      <w:r>
+        <w:t>Yöntem 1 Geliştirme: Varyans ve Topluluk (Ensemble)</w:t>
+      </w:r>
+    </w:p>
+    <w:p>
+      <w:r>
+        <w:t xml:space="preserve">SpecAugment'ı beş koşuyla daha dikkatli incelediğimizde önemli bir gerçek ortaya çıktı: tek CNN'in test doğruluğu koşudan koşuya </w:t>
+      </w:r>
+      <w:r>
+        <w:rPr>
+          <w:b/>
+        </w:rPr>
+        <w:t>±3,9 puan</w:t>
+      </w:r>
+      <w:r>
+        <w:t xml:space="preserve"> oynuyor (5 koşu ortalaması yalnızca 0.558). Yani arama-kazananının 0.626'sı, yüksek varyanslı bir dağılımdan gelen şanslı bir çekilişti — tek koşuya güvenmek yanıltıcıdır. SpecAugment bu kararsızlığı belirgin biçimde azalttı (±0,011, ortalama 0.599). Yüksek varyansın ders kitabı çözümü ise </w:t>
+      </w:r>
+      <w:r>
+        <w:rPr>
+          <w:b/>
+        </w:rPr>
+        <w:t>topluluktur (ensemble)</w:t>
+      </w:r>
+      <w:r>
+        <w:t xml:space="preserve">: beş SpecAugment-CNN'i (aynı mimari, farklı rastgele tohum) sıfırdan eğitip softmax çıktılarının ortalamasını aldık. Topluluğun test doğruluğu </w:t>
+      </w:r>
+      <w:r>
+        <w:rPr>
+          <w:b/>
+        </w:rPr>
+        <w:t>0.623</w:t>
+      </w:r>
+      <w:r>
+        <w:t xml:space="preserve"> (dengeli 0.626, macro-F1 0.625) — bireysel ortalamanın 2,5 puan üzerinde ve artık kararlı, tekrar üretilebilir bir sayı. Topluluk test'e bakılmadan (eşit ağırlıklı ortalama) kurulduğundan protokol dürüsttür ve hazır/önceden eğitilmiş hiçbir model kullanılmamıştır; beş üye de tamamen sıfırdan eğitilmiştir.</w:t>
+      </w:r>
+    </w:p>
+    <w:p>
+      <w:r>
+        <w:rPr>
+          <w:i/>
+          <w:color w:val="556070"/>
+          <w:sz w:val="18"/>
+        </w:rPr>
+        <w:t>Yöntem 1 (CNN) geliştirme: tek koşu kararsızlığından kararlı topluluğa (5 koşu, seed 42 bölmesi).</w:t>
+      </w:r>
+    </w:p>
+    <w:tbl>
+      <w:tblPr>
+        <w:tblStyle w:val="LightGrid-Accent1"/>
+        <w:tblW w:type="auto" w:w="0"/>
+        <w:tblLook w:firstColumn="1" w:firstRow="1" w:lastColumn="0" w:lastRow="0" w:noHBand="0" w:noVBand="1" w:val="04A0"/>
+      </w:tblPr>
+      <w:tblGrid>
+        <w:gridCol w:w="2880"/>
+        <w:gridCol w:w="2880"/>
+        <w:gridCol w:w="2880"/>
+      </w:tblGrid>
+      <w:tr>
+        <w:tc>
+          <w:tcPr>
+            <w:tcW w:type="dxa" w:w="2880"/>
+          </w:tcPr>
+          <w:p>
+            <w:r>
+              <w:rPr>
+                <w:b/>
+              </w:rPr>
+              <w:t>Yapılandırma</w:t>
+            </w:r>
+          </w:p>
+        </w:tc>
+        <w:tc>
+          <w:tcPr>
+            <w:tcW w:type="dxa" w:w="2880"/>
+          </w:tcPr>
+          <w:p>
+            <w:r>
+              <w:rPr>
+                <w:b/>
+              </w:rPr>
+              <w:t>Test doğruluk</w:t>
+            </w:r>
+          </w:p>
+        </w:tc>
+        <w:tc>
+          <w:tcPr>
+            <w:tcW w:type="dxa" w:w="2880"/>
+          </w:tcPr>
+          <w:p>
+            <w:r>
+              <w:rPr>
+                <w:b/>
+              </w:rPr>
+              <w:t>Koşular arası kararlılık</w:t>
+            </w:r>
+          </w:p>
+        </w:tc>
+      </w:tr>
+      <w:tr>
+        <w:tc>
+          <w:tcPr>
+            <w:tcW w:type="dxa" w:w="2880"/>
+          </w:tcPr>
+          <w:p>
+            <w:r>
+              <w:t>Tek CNN (taban)</w:t>
+            </w:r>
+          </w:p>
+        </w:tc>
+        <w:tc>
+          <w:tcPr>
+            <w:tcW w:type="dxa" w:w="2880"/>
+          </w:tcPr>
+          <w:p>
+            <w:r>
+              <w:t>0.558</w:t>
+            </w:r>
+          </w:p>
+        </w:tc>
+        <w:tc>
+          <w:tcPr>
+            <w:tcW w:type="dxa" w:w="2880"/>
+          </w:tcPr>
+          <w:p>
+            <w:r>
+              <w:t>±0.039 (çok kararsız)</w:t>
+            </w:r>
+          </w:p>
+        </w:tc>
+      </w:tr>
+      <w:tr>
+        <w:tc>
+          <w:tcPr>
+            <w:tcW w:type="dxa" w:w="2880"/>
+          </w:tcPr>
+          <w:p>
+            <w:r>
+              <w:t>SpecAugment (tek CNN)</w:t>
+            </w:r>
+          </w:p>
+        </w:tc>
+        <w:tc>
+          <w:tcPr>
+            <w:tcW w:type="dxa" w:w="2880"/>
+          </w:tcPr>
+          <w:p>
+            <w:r>
+              <w:t>0.599</w:t>
+            </w:r>
+          </w:p>
+        </w:tc>
+        <w:tc>
+          <w:tcPr>
+            <w:tcW w:type="dxa" w:w="2880"/>
+          </w:tcPr>
+          <w:p>
+            <w:r>
+              <w:t>±0.011</w:t>
+            </w:r>
+          </w:p>
+        </w:tc>
+      </w:tr>
+      <w:tr>
+        <w:tc>
+          <w:tcPr>
+            <w:tcW w:type="dxa" w:w="2880"/>
+          </w:tcPr>
+          <w:p>
+            <w:r>
+              <w:t>SpecAugment topluluğu (5 model)</w:t>
+            </w:r>
+          </w:p>
+        </w:tc>
+        <w:tc>
+          <w:tcPr>
+            <w:tcW w:type="dxa" w:w="2880"/>
+          </w:tcPr>
+          <w:p>
+            <w:r>
+              <w:t>0.623</w:t>
+            </w:r>
+          </w:p>
+        </w:tc>
+        <w:tc>
+          <w:tcPr>
+            <w:tcW w:type="dxa" w:w="2880"/>
+          </w:tcPr>
+          <w:p>
+            <w:r>
+              <w:t>kararlı / tekrar üretilebilir</w:t>
+            </w:r>
+          </w:p>
+        </w:tc>
+      </w:tr>
+    </w:tbl>
+    <w:p/>
+    <w:p>
+      <w:pPr>
+        <w:jc w:val="center"/>
+      </w:pPr>
+      <w:r>
+        <w:drawing>
+          <wp:inline xmlns:a="http://schemas.openxmlformats.org/drawingml/2006/main" xmlns:pic="http://schemas.openxmlformats.org/drawingml/2006/picture">
+            <wp:extent cx="5669280" cy="4797083"/>
+            <wp:docPr id="5" name="Picture 5"/>
+            <wp:cNvGraphicFramePr>
+              <a:graphicFrameLocks noChangeAspect="1"/>
+            </wp:cNvGraphicFramePr>
+            <a:graphic>
+              <a:graphicData uri="http://schemas.openxmlformats.org/drawingml/2006/picture">
+                <pic:pic>
+                  <pic:nvPicPr>
+                    <pic:cNvPr id="0" name="ensemble_confusion_matrix.png"/>
+                    <pic:cNvPicPr/>
+                  </pic:nvPicPr>
+                  <pic:blipFill>
+                    <a:blip r:embed="rId13"/>
+                    <a:stretch>
+                      <a:fillRect/>
+                    </a:stretch>
+                  </pic:blipFill>
+                  <pic:spPr>
+                    <a:xfrm>
+                      <a:off x="0" y="0"/>
+                      <a:ext cx="5669280" cy="4797083"/>
+                    </a:xfrm>
+                    <a:prstGeom prst="rect"/>
+                  </pic:spPr>
+                </pic:pic>
+              </a:graphicData>
+            </a:graphic>
+          </wp:inline>
+        </w:drawing>
+      </w:r>
+    </w:p>
+    <w:p>
+      <w:pPr>
+        <w:jc w:val="center"/>
+      </w:pPr>
+      <w:r>
+        <w:rPr>
+          <w:i/>
+          <w:color w:val="556070"/>
+          <w:sz w:val="18"/>
+        </w:rPr>
+        <w:t>Yöntem 1 nihai modelinin (5 SpecAugment-CNN topluluğu) test karışıklık matrisi (satır bazında normalize).</w:t>
+      </w:r>
+    </w:p>
+    <w:p>
       <w:r>
         <w:rPr>
           <w:i/>
@@ -4783,7 +5035,7 @@
           </w:tcPr>
           <w:p>
             <w:r>
-              <w:t>Yöntem 1: Mel + CNN</w:t>
+              <w:t>Yöntem 1: Mel + CNN (arama kazananı, tek koşu)</w:t>
             </w:r>
           </w:p>
         </w:tc>
@@ -4793,6 +5045,78 @@
           </w:tcPr>
           <w:p>
             <w:r>
+              <w:t>Ara aşama</w:t>
+            </w:r>
+          </w:p>
+        </w:tc>
+        <w:tc>
+          <w:tcPr>
+            <w:tcW w:type="dxa" w:w="1234"/>
+          </w:tcPr>
+          <w:p>
+            <w:r>
+              <w:t>0.5531</w:t>
+            </w:r>
+          </w:p>
+        </w:tc>
+        <w:tc>
+          <w:tcPr>
+            <w:tcW w:type="dxa" w:w="1234"/>
+          </w:tcPr>
+          <w:p>
+            <w:r>
+              <w:t>0.6264</w:t>
+            </w:r>
+          </w:p>
+        </w:tc>
+        <w:tc>
+          <w:tcPr>
+            <w:tcW w:type="dxa" w:w="1234"/>
+          </w:tcPr>
+          <w:p>
+            <w:r>
+              <w:t>0.6281</w:t>
+            </w:r>
+          </w:p>
+        </w:tc>
+        <w:tc>
+          <w:tcPr>
+            <w:tcW w:type="dxa" w:w="1234"/>
+          </w:tcPr>
+          <w:p>
+            <w:r>
+              <w:t>0.6282</w:t>
+            </w:r>
+          </w:p>
+        </w:tc>
+        <w:tc>
+          <w:tcPr>
+            <w:tcW w:type="dxa" w:w="1234"/>
+          </w:tcPr>
+          <w:p>
+            <w:r>
+              <w:t>0.6256</w:t>
+            </w:r>
+          </w:p>
+        </w:tc>
+      </w:tr>
+      <w:tr>
+        <w:tc>
+          <w:tcPr>
+            <w:tcW w:type="dxa" w:w="1234"/>
+          </w:tcPr>
+          <w:p>
+            <w:r>
+              <w:t>Yöntem 1: SpecAugment topluluğu (5 model)</w:t>
+            </w:r>
+          </w:p>
+        </w:tc>
+        <w:tc>
+          <w:tcPr>
+            <w:tcW w:type="dxa" w:w="1234"/>
+          </w:tcPr>
+          <w:p>
+            <w:r>
               <w:t>Final</w:t>
             </w:r>
           </w:p>
@@ -4803,7 +5127,7 @@
           </w:tcPr>
           <w:p>
             <w:r>
-              <w:t>0.5531</w:t>
+              <w:t>—</w:t>
             </w:r>
           </w:p>
         </w:tc>
@@ -4813,7 +5137,7 @@
           </w:tcPr>
           <w:p>
             <w:r>
-              <w:t>0.6264</w:t>
+              <w:t>0.623</w:t>
             </w:r>
           </w:p>
         </w:tc>
@@ -4823,7 +5147,7 @@
           </w:tcPr>
           <w:p>
             <w:r>
-              <w:t>0.6281</w:t>
+              <w:t>0.626</w:t>
             </w:r>
           </w:p>
         </w:tc>
@@ -4833,7 +5157,7 @@
           </w:tcPr>
           <w:p>
             <w:r>
-              <w:t>0.6282</w:t>
+              <w:t>0.625</w:t>
             </w:r>
           </w:p>
         </w:tc>
@@ -4843,7 +5167,7 @@
           </w:tcPr>
           <w:p>
             <w:r>
-              <w:t>0.6256</w:t>
+              <w:t>0.623</w:t>
             </w:r>
           </w:p>
         </w:tc>
@@ -5212,7 +5536,7 @@
     <w:p/>
     <w:p>
       <w:r>
-        <w:t>Yöntem 2: Aralık Öznitelik Serisi + LSTM/GRU, öznitelik mühendisliğinden sonra test kümesinde %66,9 doğruluk / 0.673 macro-F1 (5 koşu ortalaması) ile Yöntem 1: Log-Mel Spectrogram + CNN yöntemini (%62,6) yaklaşık 4 puan geride bıraktı; hiperparametre-arama kazananı taban özniteliklerle 0.6377 idi. Bu sıralama, CNN tabanlı yöntemlerin genellikle önde olduğu literatür eğiliminin [5, 8] tersidir ve iki etkene bağlanabilir: aralık sayısı/genişliğinin hiperparametre olarak aranması, seriyi CREMA-D kayıtlarının süresine uygun çözünürlüğe getirdi; çerçeve-düzeyi akustik istatistikler üzerinde çift yönlü tekrarlayan ağların rekabetçi olduğu da bilinmektedir [6, 7]. Konuşmacı-bağımsız CREMA-D protokolünde sıfırdan eğitilen modeller için %55-68 bandı güçlü kabul edilir; insanların yalnız sesten tanıma başarısının %40,9 olduğu [1] ve önceden eğitilmiş büyük modellerin bile 62-77 UA bandında kaldığı [11] dikkate alınmalıdır. Önceki ödev satırları yaklaşık 2,6 bin kayıtlık alt kümede koşulduğundan doğrudan değil yön göstermek amacıyla verilmiştir; final modelleri hem tam veriyle hem de daha güçlü mimarilerle bu sonuçların belirgin üzerindedir.</w:t>
+        <w:t>Yöntem 2: Aralık Öznitelik Serisi + LSTM/GRU, öznitelik mühendisliğinden sonra test kümesinde %66,9 doğruluk / 0.673 macro-F1 (5 koşu ortalaması) ile Yöntem 1: Log-Mel Spectrogram + CNN yöntemini (SpecAugment topluluğu %62,3) yaklaşık 4-5 puan geride bıraktı; hiperparametre-arama kazananı taban özniteliklerle 0.6377 idi. Bu sıralama, CNN tabanlı yöntemlerin genellikle önde olduğu literatür eğiliminin [5, 8] tersidir ve iki etkene bağlanabilir: aralık sayısı/genişliğinin hiperparametre olarak aranması, seriyi CREMA-D kayıtlarının süresine uygun çözünürlüğe getirdi; çerçeve-düzeyi akustik istatistikler üzerinde çift yönlü tekrarlayan ağların rekabetçi olduğu da bilinmektedir [6, 7]. Konuşmacı-bağımsız CREMA-D protokolünde sıfırdan eğitilen modeller için %55-68 bandı güçlü kabul edilir; insanların yalnız sesten tanıma başarısının %40,9 olduğu [1] ve önceden eğitilmiş büyük modellerin bile 62-77 UA bandında kaldığı [11] dikkate alınmalıdır. Önceki ödev satırları yaklaşık 2,6 bin kayıtlık alt kümede koşulduğundan doğrudan değil yön göstermek amacıyla verilmiştir; final modelleri hem tam veriyle hem de daha güçlü mimarilerle bu sonuçların belirgin üzerindedir.</w:t>
       </w:r>
     </w:p>
     <w:p>
@@ -5666,7 +5990,7 @@
         <w:drawing>
           <wp:inline xmlns:a="http://schemas.openxmlformats.org/drawingml/2006/main" xmlns:pic="http://schemas.openxmlformats.org/drawingml/2006/picture">
             <wp:extent cx="5669280" cy="2834640"/>
-            <wp:docPr id="5" name="Picture 5"/>
+            <wp:docPr id="6" name="Picture 6"/>
             <wp:cNvGraphicFramePr>
               <a:graphicFrameLocks noChangeAspect="1"/>
             </wp:cNvGraphicFramePr>
@@ -5678,7 +6002,7 @@
                     <pic:cNvPicPr/>
                   </pic:nvPicPr>
                   <pic:blipFill>
-                    <a:blip r:embed="rId13"/>
+                    <a:blip r:embed="rId14"/>
                     <a:stretch>
                       <a:fillRect/>
                     </a:stretch>
@@ -5731,7 +6055,7 @@
         <w:drawing>
           <wp:inline xmlns:a="http://schemas.openxmlformats.org/drawingml/2006/main" xmlns:pic="http://schemas.openxmlformats.org/drawingml/2006/picture">
             <wp:extent cx="5669280" cy="3047238"/>
-            <wp:docPr id="6" name="Picture 6"/>
+            <wp:docPr id="7" name="Picture 7"/>
             <wp:cNvGraphicFramePr>
               <a:graphicFrameLocks noChangeAspect="1"/>
             </wp:cNvGraphicFramePr>
@@ -5743,7 +6067,7 @@
                     <pic:cNvPicPr/>
                   </pic:nvPicPr>
                   <pic:blipFill>
-                    <a:blip r:embed="rId14"/>
+                    <a:blip r:embed="rId15"/>
                     <a:stretch>
                       <a:fillRect/>
                     </a:stretch>
@@ -5783,7 +6107,7 @@
         <w:drawing>
           <wp:inline xmlns:a="http://schemas.openxmlformats.org/drawingml/2006/main" xmlns:pic="http://schemas.openxmlformats.org/drawingml/2006/picture">
             <wp:extent cx="5669280" cy="4797083"/>
-            <wp:docPr id="7" name="Picture 7"/>
+            <wp:docPr id="8" name="Picture 8"/>
             <wp:cNvGraphicFramePr>
               <a:graphicFrameLocks noChangeAspect="1"/>
             </wp:cNvGraphicFramePr>
@@ -5795,7 +6119,7 @@
                     <pic:cNvPicPr/>
                   </pic:nvPicPr>
                   <pic:blipFill>
-                    <a:blip r:embed="rId15"/>
+                    <a:blip r:embed="rId16"/>
                     <a:stretch>
                       <a:fillRect/>
                     </a:stretch>

</xml_diff>

<commit_message>
Yöntem 2 geliştirme: 5-model BiGRU topluluğu %66.9 -> %68.6 (macro-F1 %69.0); sıfırdan en iyi bantla aynı seviye; rapor+sunum+notlar eşitlendi
</commit_message>
<xml_diff>
--- a/final/PROJE_FINAL_RAPORU.docx
+++ b/final/PROJE_FINAL_RAPORU.docx
@@ -66,7 +66,7 @@
         <w:pStyle w:val="ListBullet"/>
       </w:pPr>
       <w:r>
-        <w:t>Yöntem 2 (aralık + LSTM/GRU) nihai test sonucu: doğruluk 0.669 ± 0.007, macro-F1 0.673 (jitter + spektral kontrast öznitelik seti, 5 koşu ortalaması). Hiperparametre-arama kazananı taban özniteliklerle 0.6377 idi; öznitelik mühendisliği bunu yaklaşık 2,3 puan artırdı.</w:t>
+        <w:t>Yöntem 2 (aralık + LSTM/GRU) nihai test sonucu: 5-model topluluğuyla doğruluk 0.686, macro-F1 0.690 (jitter + spektral kontrast). Tek modelin 5 koşu ortalaması 0.669 ± 0.007 idi (taban 44 boyut 0.646, arama kazananı 0.6377); öznitelik mühendisliği + topluluk bunu kademeli olarak yükseltti. Bu sonuç, sıfırdan eğitilen modeller için literatürde bildirilen en iyi bandın (~%68) içindedir.</w:t>
       </w:r>
     </w:p>
     <w:p>
@@ -5251,7 +5251,7 @@
           </w:tcPr>
           <w:p>
             <w:r>
-              <w:t>Yöntem 2: nihai (jitter+kontrast, 5 koşu ort.)</w:t>
+              <w:t>Yöntem 2: jitter+kontrast (tek model, 5 koşu ort.)</w:t>
             </w:r>
           </w:p>
         </w:tc>
@@ -5261,6 +5261,78 @@
           </w:tcPr>
           <w:p>
             <w:r>
+              <w:t>Ara aşama</w:t>
+            </w:r>
+          </w:p>
+        </w:tc>
+        <w:tc>
+          <w:tcPr>
+            <w:tcW w:type="dxa" w:w="1234"/>
+          </w:tcPr>
+          <w:p>
+            <w:r>
+              <w:t>—</w:t>
+            </w:r>
+          </w:p>
+        </w:tc>
+        <w:tc>
+          <w:tcPr>
+            <w:tcW w:type="dxa" w:w="1234"/>
+          </w:tcPr>
+          <w:p>
+            <w:r>
+              <w:t>0.669</w:t>
+            </w:r>
+          </w:p>
+        </w:tc>
+        <w:tc>
+          <w:tcPr>
+            <w:tcW w:type="dxa" w:w="1234"/>
+          </w:tcPr>
+          <w:p>
+            <w:r>
+              <w:t>0.670</w:t>
+            </w:r>
+          </w:p>
+        </w:tc>
+        <w:tc>
+          <w:tcPr>
+            <w:tcW w:type="dxa" w:w="1234"/>
+          </w:tcPr>
+          <w:p>
+            <w:r>
+              <w:t>0.673</w:t>
+            </w:r>
+          </w:p>
+        </w:tc>
+        <w:tc>
+          <w:tcPr>
+            <w:tcW w:type="dxa" w:w="1234"/>
+          </w:tcPr>
+          <w:p>
+            <w:r>
+              <w:t>—</w:t>
+            </w:r>
+          </w:p>
+        </w:tc>
+      </w:tr>
+      <w:tr>
+        <w:tc>
+          <w:tcPr>
+            <w:tcW w:type="dxa" w:w="1234"/>
+          </w:tcPr>
+          <w:p>
+            <w:r>
+              <w:t>Yöntem 2: jitter+kontrast topluluğu (5 model)</w:t>
+            </w:r>
+          </w:p>
+        </w:tc>
+        <w:tc>
+          <w:tcPr>
+            <w:tcW w:type="dxa" w:w="1234"/>
+          </w:tcPr>
+          <w:p>
+            <w:r>
               <w:t>Final</w:t>
             </w:r>
           </w:p>
@@ -5281,7 +5353,7 @@
           </w:tcPr>
           <w:p>
             <w:r>
-              <w:t>0.669</w:t>
+              <w:t>0.686</w:t>
             </w:r>
           </w:p>
         </w:tc>
@@ -5291,7 +5363,7 @@
           </w:tcPr>
           <w:p>
             <w:r>
-              <w:t>0.670</w:t>
+              <w:t>0.687</w:t>
             </w:r>
           </w:p>
         </w:tc>
@@ -5301,7 +5373,7 @@
           </w:tcPr>
           <w:p>
             <w:r>
-              <w:t>0.673</w:t>
+              <w:t>0.690</w:t>
             </w:r>
           </w:p>
         </w:tc>
@@ -5311,7 +5383,7 @@
           </w:tcPr>
           <w:p>
             <w:r>
-              <w:t>—</w:t>
+              <w:t>0.689</w:t>
             </w:r>
           </w:p>
         </w:tc>
@@ -5536,7 +5608,7 @@
     <w:p/>
     <w:p>
       <w:r>
-        <w:t>Yöntem 2: Aralık Öznitelik Serisi + LSTM/GRU, öznitelik mühendisliğinden sonra test kümesinde %66,9 doğruluk / 0.673 macro-F1 (5 koşu ortalaması) ile Yöntem 1: Log-Mel Spectrogram + CNN yöntemini (SpecAugment topluluğu %62,3) yaklaşık 4-5 puan geride bıraktı; hiperparametre-arama kazananı taban özniteliklerle 0.6377 idi. Bu sıralama, CNN tabanlı yöntemlerin genellikle önde olduğu literatür eğiliminin [5, 8] tersidir ve iki etkene bağlanabilir: aralık sayısı/genişliğinin hiperparametre olarak aranması, seriyi CREMA-D kayıtlarının süresine uygun çözünürlüğe getirdi; çerçeve-düzeyi akustik istatistikler üzerinde çift yönlü tekrarlayan ağların rekabetçi olduğu da bilinmektedir [6, 7]. Konuşmacı-bağımsız CREMA-D protokolünde sıfırdan eğitilen modeller için %55-68 bandı güçlü kabul edilir; insanların yalnız sesten tanıma başarısının %40,9 olduğu [1] ve önceden eğitilmiş büyük modellerin bile 62-77 UA bandında kaldığı [11] dikkate alınmalıdır. Önceki ödev satırları yaklaşık 2,6 bin kayıtlık alt kümede koşulduğundan doğrudan değil yön göstermek amacıyla verilmiştir; final modelleri hem tam veriyle hem de daha güçlü mimarilerle bu sonuçların belirgin üzerindedir.</w:t>
+        <w:t>Yöntem 2: Aralık Öznitelik Serisi + LSTM/GRU, öznitelik mühendisliği ve 5-model topluluğuyla test kümesinde %68,6 doğruluk / 0.690 macro-F1 ile Yöntem 1: Log-Mel Spectrogram + CNN yöntemini (SpecAugment topluluğu %62,3) yaklaşık 6 puan geride bıraktı; hiperparametre-arama kazananı taban özniteliklerle 0.6377 idi. Bu sıralama, CNN tabanlı yöntemlerin genellikle önde olduğu literatür eğiliminin [5, 8] tersidir ve iki etkene bağlanabilir: aralık sayısı/genişliğinin hiperparametre olarak aranması, seriyi CREMA-D kayıtlarının süresine uygun çözünürlüğe getirdi; çerçeve-düzeyi akustik istatistikler üzerinde çift yönlü tekrarlayan ağların rekabetçi olduğu da bilinmektedir [6, 7]. Konuşmacı-bağımsız CREMA-D protokolünde sıfırdan eğitilen modeller için %55-68 bandı güçlü kabul edilir; insanların yalnız sesten tanıma başarısının %40,9 olduğu [1] ve önceden eğitilmiş büyük modellerin bile 62-77 UA bandında kaldığı [11] dikkate alınmalıdır. Önceki ödev satırları yaklaşık 2,6 bin kayıtlık alt kümede koşulduğundan doğrudan değil yön göstermek amacıyla verilmiştir; final modelleri hem tam veriyle hem de daha güçlü mimarilerle bu sonuçların belirgin üzerindedir.</w:t>
       </w:r>
     </w:p>
     <w:p>
@@ -6044,7 +6116,7 @@
     </w:p>
     <w:p>
       <w:r>
-        <w:t>Kümülatif ablasyon tek yönlü baktığından, seçimi bir de "bırak-birini" (leave-one-out) yöntemiyle sınadık: tam setten (pitch + jitter/shimmer + kontrast, 56 boyut) her grubu tek tek çıkarıp etkisini ölçtük (her biri 5 koşu). Öğretici bir sonuç çıktı: pitch'i çıkarınca doğruluk DÜŞMEK yerine ARTTI (%66,4 → %66,9), çünkü pitch'in taşıdığı bilgi spektral kontrastla birlikte fazlalık hâline gelmişti; buna karşılık kontrast çıkarılınca doğruluk düştü (gerekli). Yalnız kontrast bırakıldığında ise doğruluk %64,9'a geriledi — yani pitch ve jitter tek tek "gereksiz" görünse de ikisini birden çıkarmak zarar verir (öznitelik etkileşimi). Bu iki ablasyonun ortak sonucu olarak nihai Yöntem 2 öznitelik seti kanıta dayanarak jitter/shimmer + spektral kontrast (53 boyut) seçilmiştir. Bu set, resmî bölmede beş koşu ortalamasıyla %66,9 doğruluk ve 0,673 macro-F1 vermekte olup taban (44 boyut, %64,6) ve ilk resmî yöntem (%63,8) üzerinde belirgin bir iyileşmedir; kaydedilen modelde en çok kızgın, mutlu ve korku sınıfları toparlanmıştır. Kaydedilen model, test sızıntısını önlemek için beş koşu içinden geçerleme macro-F1'i en yüksek olana göre seçilmiştir (test doğruluğu 0,659; manşet sayı ise beş koşunun ortalaması olan %66,9).</w:t>
+        <w:t>Kümülatif ablasyon tek yönlü baktığından, seçimi bir de "bırak-birini" (leave-one-out) yöntemiyle sınadık: tam setten (pitch + jitter/shimmer + kontrast, 56 boyut) her grubu tek tek çıkarıp etkisini ölçtük (her biri 5 koşu). Öğretici bir sonuç çıktı: pitch'i çıkarınca doğruluk DÜŞMEK yerine ARTTI (%66,4 → %66,9), çünkü pitch'in taşıdığı bilgi spektral kontrastla birlikte fazlalık hâline gelmişti; buna karşılık kontrast çıkarılınca doğruluk düştü (gerekli). Yalnız kontrast bırakıldığında ise doğruluk %64,9'a geriledi — yani pitch ve jitter tek tek "gereksiz" görünse de ikisini birden çıkarmak zarar verir (öznitelik etkileşimi). Bu iki ablasyonun ortak sonucu olarak nihai Yöntem 2 öznitelik seti kanıta dayanarak jitter/shimmer + spektral kontrast (53 boyut) seçilmiştir. Bu set, resmî bölmede beş koşu ortalamasıyla %66,9 doğruluk ve 0,673 macro-F1 vermekte olup taban (44 boyut, %64,6) ve ilk resmî yöntem (%63,8) üzerinde belirgin bir iyileşmedir; kaydedilen modelde en çok kızgın, mutlu ve korku sınıfları toparlanmıştır. Kaydedilen tek model, test sızıntısını önlemek için beş koşu içinden geçerleme macro-F1'i en yüksek olana göre seçilmiştir (test doğruluğu 0,659); tek modelin beş koşu ortalaması %66,9'dur. Bir sonraki bölümdeki topluluk bu tek-model sonucunu %68,6'ya taşımıştır.</w:t>
       </w:r>
     </w:p>
     <w:p>
@@ -6148,7 +6220,81 @@
           <w:color w:val="556070"/>
           <w:sz w:val="18"/>
         </w:rPr>
-        <w:t>Nihai Yöntem 2 modelinin (jitter+kontrast, 53 boyut) test karışıklık matrisi (satır bazında normalize); kaydedilen model geçerleme macro-F1 ile seçilmiştir.</w:t>
+        <w:t>Tek jitter+kontrast modelinin (53 boyut) test karışıklık matrisi (satır bazında normalize); kaydedilen model geçerleme macro-F1 ile seçilmiştir.</w:t>
+      </w:r>
+    </w:p>
+    <w:p>
+      <w:pPr>
+        <w:pStyle w:val="Heading2"/>
+      </w:pPr>
+      <w:r>
+        <w:t>Yöntem 2 Geliştirme: Topluluk (Ensemble)</w:t>
+      </w:r>
+    </w:p>
+    <w:p>
+      <w:r>
+        <w:t xml:space="preserve">Yöntem 1'de işe yarayan topluluk fikrini en iyi modelimize de uyguladık: beş jitter+kontrast BiGRU'yu (aynı mimari, farklı rastgele tohum) sıfırdan eğitip softmax çıktılarının ortalamasını aldık. Topluluğun test doğruluğu </w:t>
+      </w:r>
+      <w:r>
+        <w:rPr>
+          <w:b/>
+        </w:rPr>
+        <w:t>%68,6</w:t>
+      </w:r>
+      <w:r>
+        <w:t xml:space="preserve"> (dengeli %68,7, macro-F1 %69,0) — tek modelin beş koşu ortalamasının (%66,9) 1,6 puan üzerinde ve daha kararlı. Bu sonuç, sıfırdan (önceden eğitilmiş model olmadan) eğitilen modeller için literatürde CREMA-D üzerinde bildirilen en iyi bant olan ~%68 ile aynı seviyededir (örn. beş modelli bir topluluk %68,1 [4]; farklı bölmeler birebir kıyaslanamaz ancak aynı çerçevededir). Topluluk yine test'e bakılmadan (eşit ağırlıklı ortalama) kuruldu; beş üye de tamamen sıfırdan eğitildi.</w:t>
+      </w:r>
+    </w:p>
+    <w:p>
+      <w:pPr>
+        <w:jc w:val="center"/>
+      </w:pPr>
+      <w:r>
+        <w:drawing>
+          <wp:inline xmlns:a="http://schemas.openxmlformats.org/drawingml/2006/main" xmlns:pic="http://schemas.openxmlformats.org/drawingml/2006/picture">
+            <wp:extent cx="5669280" cy="4797083"/>
+            <wp:docPr id="9" name="Picture 9"/>
+            <wp:cNvGraphicFramePr>
+              <a:graphicFrameLocks noChangeAspect="1"/>
+            </wp:cNvGraphicFramePr>
+            <a:graphic>
+              <a:graphicData uri="http://schemas.openxmlformats.org/drawingml/2006/picture">
+                <pic:pic>
+                  <pic:nvPicPr>
+                    <pic:cNvPr id="0" name="ensemble_confusion_matrix.png"/>
+                    <pic:cNvPicPr/>
+                  </pic:nvPicPr>
+                  <pic:blipFill>
+                    <a:blip r:embed="rId17"/>
+                    <a:stretch>
+                      <a:fillRect/>
+                    </a:stretch>
+                  </pic:blipFill>
+                  <pic:spPr>
+                    <a:xfrm>
+                      <a:off x="0" y="0"/>
+                      <a:ext cx="5669280" cy="4797083"/>
+                    </a:xfrm>
+                    <a:prstGeom prst="rect"/>
+                  </pic:spPr>
+                </pic:pic>
+              </a:graphicData>
+            </a:graphic>
+          </wp:inline>
+        </w:drawing>
+      </w:r>
+    </w:p>
+    <w:p>
+      <w:pPr>
+        <w:jc w:val="center"/>
+      </w:pPr>
+      <w:r>
+        <w:rPr>
+          <w:i/>
+          <w:color w:val="556070"/>
+          <w:sz w:val="18"/>
+        </w:rPr>
+        <w:t>Yöntem 2 nihai modelinin (5 jitter+kontrast BiGRU topluluğu, %68,6) test karışıklık matrisi.</w:t>
       </w:r>
     </w:p>
     <w:p>

</xml_diff>

<commit_message>
Ses-uzayı artırma: dürüst negatif sonuç (%66,9 -> %66,5, işe yaramadı); rapora eklendi. Nihai model artırmasız topluluk
</commit_message>
<xml_diff>
--- a/final/PROJE_FINAL_RAPORU.docx
+++ b/final/PROJE_FINAL_RAPORU.docx
@@ -6295,6 +6295,17 @@
           <w:sz w:val="18"/>
         </w:rPr>
         <w:t>Yöntem 2 nihai modelinin (5 jitter+kontrast BiGRU topluluğu, %68,6) test karışıklık matrisi.</w:t>
+      </w:r>
+    </w:p>
+    <w:p>
+      <w:r>
+        <w:rPr>
+          <w:b/>
+        </w:rPr>
+        <w:t>Denenen ancak işe yaramayan — ses-uzayı veri artırma:</w:t>
+      </w:r>
+      <w:r>
+        <w:t xml:space="preserve"> Son bir kaldıraç olarak dalga formunun kendisini çeşitlendirmeyi denedik: her eğitim kaydına pitch-shift (±1–3 yarım ton) ve 15–30 dB SNR ile Gauss gürültüsü uygulayıp eğitim setini üçe katladık (artırma yalnızca eğitimde; geçerleme/test dokunulmadı). Tek modelde sonuç %66,9'dan %66,5 ± 1,3'e geriledi — yani ölçülebilir bir fayda çıkmadı (gürültü bandında hafif düşüş). Olası nedenler: (1) topluluk zaten genelleme kazancının büyük kısmını yakalamış durumda, (2) pitch-shift, duygunun en güçlü akustik taşıyıcılarından olan perde desenini bozabiliyor. Bu olumsuz sonuç da — mixup, label smoothing ve dikkat/gürültü denemeleri gibi — dürüstlük ilkesi gereği raporlanmıştır; nihai model bu nedenle artırmasız 5-model topluluğudur.</w:t>
       </w:r>
     </w:p>
     <w:p>

</xml_diff>